<commit_message>
Fix chat-template discovery, bounded analysis and coverage reporting
Inspect modern and legacy sources with loader-specific precedence; enforce byte, AST, alias and worker budgets; handle equivalent expression forms and distinguish inert text. Separate format resemblance from pinned reference equality and make incomplete coverage explicit across reports. Add regression tests, independent fixture evaluation, packaging checks, and corrected guides.
</commit_message>
<xml_diff>
--- a/ModelGuard_Execution_Commands.docx
+++ b/ModelGuard_Execution_Commands.docx
@@ -1,823 +1,264 @@
 
 <file path=word/document.xml><?xml version="1.0" encoding="utf-8"?>
-<w:document xmlns:wpc="http://schemas.microsoft.com/office/word/2010/wordprocessingCanvas" xmlns:mo="http://schemas.microsoft.com/office/mac/office/2008/main" xmlns:mc="http://schemas.openxmlformats.org/markup-compatibility/2006" xmlns:mv="urn:schemas-microsoft-com:mac:vml" xmlns:o="urn:schemas-microsoft-com:office:office" xmlns:r="http://schemas.openxmlformats.org/officeDocument/2006/relationships" xmlns:m="http://schemas.openxmlformats.org/officeDocument/2006/math" xmlns:v="urn:schemas-microsoft-com:vml" xmlns:wp14="http://schemas.microsoft.com/office/word/2010/wordprocessingDrawing" xmlns:wp="http://schemas.openxmlformats.org/drawingml/2006/wordprocessingDrawing" xmlns:w10="urn:schemas-microsoft-com:office:word" xmlns:w="http://schemas.openxmlformats.org/wordprocessingml/2006/main" xmlns:w14="http://schemas.microsoft.com/office/word/2010/wordml" xmlns:wpg="http://schemas.microsoft.com/office/word/2010/wordprocessingGroup" xmlns:wpi="http://schemas.microsoft.com/office/word/2010/wordprocessingInk" xmlns:wne="http://schemas.microsoft.com/office/word/2006/wordml" xmlns:wps="http://schemas.microsoft.com/office/word/2010/wordprocessingShape" mc:Ignorable="w14 wp14">
+<w:document xmlns:ns1="http://schemas.openxmlformats.org/markup-compatibility/2006" xmlns:w="http://schemas.openxmlformats.org/wordprocessingml/2006/main" ns1:Ignorable="w14 wp14">
   <w:body>
     <w:p>
       <w:pPr>
-        <w:spacing w:before="0" w:after="80"/>
+        <w:pStyle w:val="Title"/>
       </w:pPr>
       <w:r>
-        <w:rPr>
-          <w:rFonts w:ascii="Calibri" w:hAnsi="Calibri"/>
-          <w:b/>
-          <w:color w:val="1B365D"/>
-          <w:sz w:val="44"/>
-        </w:rPr>
-        <w:t>ModelGuard: Terminal Execution Commands</w:t>
+        <w:t xml:space="preserve">ModelGuard Execution Commands</w:t>
+      </w:r>
+    </w:p>
+    <w:p>
+      <w:r>
+        <w:t xml:space="preserve"/>
+      </w:r>
+    </w:p>
+    <w:p>
+      <w:r>
+        <w:t xml:space="preserve">Use Python 3.11+ and the repository branch containing Module 3. Run from the repository root.</w:t>
+      </w:r>
+    </w:p>
+    <w:p>
+      <w:r>
+        <w:t xml:space="preserve"/>
       </w:r>
     </w:p>
     <w:p>
       <w:pPr>
-        <w:spacing w:before="0" w:after="320"/>
+        <w:pStyle w:val="Heading1"/>
       </w:pPr>
       <w:r>
+        <w:t xml:space="preserve">Install</w:t>
+      </w:r>
+    </w:p>
+    <w:p>
+      <w:r>
+        <w:t xml:space="preserve"/>
+      </w:r>
+    </w:p>
+    <w:p>
+      <w:r>
         <w:rPr>
-          <w:rFonts w:ascii="Calibri" w:hAnsi="Calibri"/>
-          <w:i/>
-          <w:color w:val="46505F"/>
-          <w:sz w:val="22"/>
+          <w:rFonts w:ascii="Consolas" w:hAnsi="Consolas"/>
         </w:rPr>
-        <w:t>Quick Reference Guide for Module 3 (Chat Template Analyser), Full Model Scanning, and Automated Testing</w:t>
+        <w:t xml:space="preserve">python3 -m venv .venv</w:t>
+      </w:r>
+    </w:p>
+    <w:p>
+      <w:r>
+        <w:rPr>
+          <w:rFonts w:ascii="Consolas" w:hAnsi="Consolas"/>
+        </w:rPr>
+        <w:t xml:space="preserve">.venv/bin/python -m pip install -e '.[test]'</w:t>
+      </w:r>
+    </w:p>
+    <w:p>
+      <w:r>
+        <w:t xml:space="preserve"/>
       </w:r>
     </w:p>
     <w:p>
       <w:pPr>
-        <w:spacing w:before="240" w:after="80"/>
+        <w:pStyle w:val="Heading1"/>
       </w:pPr>
       <w:r>
+        <w:t xml:space="preserve">Template-only inspection</w:t>
+      </w:r>
+    </w:p>
+    <w:p>
+      <w:r>
+        <w:t xml:space="preserve"/>
+      </w:r>
+    </w:p>
+    <w:p>
+      <w:r>
         <w:rPr>
-          <w:rFonts w:ascii="Calibri" w:hAnsi="Calibri"/>
-          <w:b/>
-          <w:color w:val="1B365D"/>
-          <w:sz w:val="28"/>
+          <w:rFonts w:ascii="Consolas" w:hAnsi="Consolas"/>
         </w:rPr>
-        <w:t>1. Module 3 Only: Chat Template Static Analysis</w:t>
+        <w:t xml:space="preserve">.venv/bin/python demo_template.py</w:t>
+      </w:r>
+    </w:p>
+    <w:p>
+      <w:r>
+        <w:rPr>
+          <w:rFonts w:ascii="Consolas" w:hAnsi="Consolas"/>
+        </w:rPr>
+        <w:t xml:space="preserve">.venv/bin/python demo_template.py path/to/model.gguf</w:t>
+      </w:r>
+    </w:p>
+    <w:p>
+      <w:r>
+        <w:rPr>
+          <w:rFonts w:ascii="Consolas" w:hAnsi="Consolas"/>
+        </w:rPr>
+        <w:t xml:space="preserve">.venv/bin/python demo_template.py path/to/model.safetensors</w:t>
+      </w:r>
+    </w:p>
+    <w:p>
+      <w:r>
+        <w:t xml:space="preserve"/>
+      </w:r>
+    </w:p>
+    <w:p>
+      <w:r>
+        <w:t xml:space="preserve">File mode uses parsing and Module 3, without the structural analyser. Review parser issues and template coverage.</w:t>
+      </w:r>
+    </w:p>
+    <w:p>
+      <w:r>
+        <w:t xml:space="preserve"/>
       </w:r>
     </w:p>
     <w:p>
       <w:pPr>
-        <w:spacing w:after="120"/>
+        <w:pStyle w:val="Heading1"/>
       </w:pPr>
       <w:r>
-        <w:t xml:space="preserve">Use this script when you want to inspect </w:t>
+        <w:t xml:space="preserve">Full scanner</w:t>
       </w:r>
+    </w:p>
+    <w:p>
+      <w:r>
+        <w:t xml:space="preserve"/>
+      </w:r>
+    </w:p>
+    <w:p>
       <w:r>
         <w:rPr>
-          <w:b/>
+          <w:rFonts w:ascii="Consolas" w:hAnsi="Consolas"/>
         </w:rPr>
-        <w:t>exclusively the chat template</w:t>
+        <w:t xml:space="preserve">.venv/bin/python -m modelguard scan samples/valid_model.gguf</w:t>
       </w:r>
+    </w:p>
+    <w:p>
       <w:r>
-        <w:t xml:space="preserve"> of a model file. It isolates Module 3, extracting template strings from metadata or sibling tokenizer files and performing static Jinja AST analysis without running Module 2 structural checks.</w:t>
+        <w:rPr>
+          <w:rFonts w:ascii="Consolas" w:hAnsi="Consolas"/>
+        </w:rPr>
+        <w:t xml:space="preserve">.venv/bin/python -m modelguard scan path/to/model.safetensors \</w:t>
+      </w:r>
+    </w:p>
+    <w:p>
+      <w:r>
+        <w:rPr>
+          <w:rFonts w:ascii="Consolas" w:hAnsi="Consolas"/>
+        </w:rPr>
+        <w:t xml:space="preserve">  --json report.json \</w:t>
+      </w:r>
+    </w:p>
+    <w:p>
+      <w:r>
+        <w:rPr>
+          <w:rFonts w:ascii="Consolas" w:hAnsi="Consolas"/>
+        </w:rPr>
+        <w:t xml:space="preserve">  --html report.html</w:t>
+      </w:r>
+    </w:p>
+    <w:p>
+      <w:r>
+        <w:rPr>
+          <w:rFonts w:ascii="Consolas" w:hAnsi="Consolas"/>
+        </w:rPr>
+        <w:t xml:space="preserve">.venv/bin/python -m modelguard scan path/to/model.safetensors --template-profile processor</w:t>
+      </w:r>
+    </w:p>
+    <w:p>
+      <w:r>
+        <w:t xml:space="preserve"/>
+      </w:r>
+    </w:p>
+    <w:p>
+      <w:r>
+        <w:t xml:space="preserve">Profiles: auto, gguf, transformers and processor. Auto uses embedded GGUF or Transformers tokenizer precedence. All discovered alternatives are inspected and labelled effective or shadowed. Processor mode reports incompatible mixed legacy/modern storage.</w:t>
+      </w:r>
+    </w:p>
+    <w:p>
+      <w:r>
+        <w:t xml:space="preserve"/>
       </w:r>
     </w:p>
     <w:p>
       <w:pPr>
-        <w:spacing w:after="40"/>
+        <w:pStyle w:val="Heading1"/>
       </w:pPr>
       <w:r>
-        <w:t>Command to scan an arbitrary model file (GGUF or Safetensors):</w:t>
+        <w:t xml:space="preserve">Tests and evaluation</w:t>
       </w:r>
     </w:p>
-    <w:tbl>
-      <w:tblPr>
-        <w:tblW w:type="auto" w:w="0"/>
-        <w:jc w:val="center"/>
-        <w:tblLayout w:type="fixed"/>
-        <w:tblLook w:firstColumn="1" w:firstRow="1" w:lastColumn="0" w:lastRow="0" w:noHBand="0" w:noVBand="1" w:val="04A0"/>
-      </w:tblPr>
-      <w:tblGrid>
-        <w:gridCol w:w="9360"/>
-      </w:tblGrid>
-      <w:tr>
-        <w:tc>
-          <w:tcPr>
-            <w:tcW w:type="dxa" w:w="9360"/>
-            <w:shd w:fill="F0F4F8"/>
-            <w:tcBorders>
-              <w:top w:val="none"/>
-              <w:left w:val="single" w:sz="24" w:space="0" w:color="1B365D"/>
-              <w:bottom w:val="none"/>
-              <w:right w:val="none"/>
-            </w:tcBorders>
-          </w:tcPr>
-          <w:p>
-            <w:pPr>
-              <w:spacing w:before="120" w:after="120"/>
-              <w:ind w:left="216" w:right="216"/>
-            </w:pPr>
-            <w:r>
-              <w:rPr>
-                <w:rFonts w:ascii="Courier New" w:hAnsi="Courier New"/>
-                <w:b/>
-                <w:color w:val="141E2D"/>
-                <w:sz w:val="19"/>
-              </w:rPr>
-              <w:t>.venv/bin/python demo_template.py path/to/your_model.gguf</w:t>
-            </w:r>
-          </w:p>
-        </w:tc>
-      </w:tr>
-    </w:tbl>
     <w:p>
-      <w:pPr>
-        <w:spacing w:after="80"/>
-      </w:pPr>
+      <w:r>
+        <w:t xml:space="preserve"/>
+      </w:r>
     </w:p>
     <w:p>
-      <w:pPr>
-        <w:spacing w:after="120"/>
-      </w:pPr>
       <w:r>
         <w:rPr>
-          <w:b/>
+          <w:rFonts w:ascii="Consolas" w:hAnsi="Consolas"/>
         </w:rPr>
-        <w:t>Built-in Threat Model Demonstration (Runs 4 synthetic scenarios):</w:t>
+        <w:t xml:space="preserve">.venv/bin/python -m pytest -q</w:t>
       </w:r>
     </w:p>
-    <w:tbl>
-      <w:tblPr>
-        <w:tblW w:type="auto" w:w="0"/>
-        <w:jc w:val="center"/>
-        <w:tblLayout w:type="fixed"/>
-        <w:tblLook w:firstColumn="1" w:firstRow="1" w:lastColumn="0" w:lastRow="0" w:noHBand="0" w:noVBand="1" w:val="04A0"/>
-      </w:tblPr>
-      <w:tblGrid>
-        <w:gridCol w:w="9360"/>
-      </w:tblGrid>
-      <w:tr>
-        <w:tc>
-          <w:tcPr>
-            <w:tcW w:type="dxa" w:w="9360"/>
-            <w:shd w:fill="F0F4F8"/>
-            <w:tcBorders>
-              <w:top w:val="none"/>
-              <w:left w:val="single" w:sz="24" w:space="0" w:color="1B365D"/>
-              <w:bottom w:val="none"/>
-              <w:right w:val="none"/>
-            </w:tcBorders>
-          </w:tcPr>
-          <w:p>
-            <w:pPr>
-              <w:spacing w:before="120" w:after="120"/>
-              <w:ind w:left="216" w:right="216"/>
-            </w:pPr>
-            <w:r>
-              <w:rPr>
-                <w:rFonts w:ascii="Courier New" w:hAnsi="Courier New"/>
-                <w:b/>
-                <w:color w:val="141E2D"/>
-                <w:sz w:val="19"/>
-              </w:rPr>
-              <w:t>.venv/bin/python demo_template.py</w:t>
-            </w:r>
-          </w:p>
-        </w:tc>
-      </w:tr>
-    </w:tbl>
     <w:p>
-      <w:pPr>
-        <w:spacing w:after="80"/>
-      </w:pPr>
+      <w:r>
+        <w:rPr>
+          <w:rFonts w:ascii="Consolas" w:hAnsi="Consolas"/>
+        </w:rPr>
+        <w:t xml:space="preserve">.venv/bin/python -m pytest tests/test_template_analyzer.py tests/test_template_regressions.py -q</w:t>
+      </w:r>
     </w:p>
     <w:p>
-      <w:pPr>
-        <w:pStyle w:val="ListBullet"/>
-        <w:spacing w:after="40"/>
-      </w:pPr>
       <w:r>
         <w:rPr>
-          <w:b/>
+          <w:rFonts w:ascii="Consolas" w:hAnsi="Consolas"/>
         </w:rPr>
-        <w:t xml:space="preserve">What it evaluates: </w:t>
+        <w:t xml:space="preserve">.venv/bin/python -m modelguard.evaluate_templates</w:t>
       </w:r>
+    </w:p>
+    <w:p>
       <w:r>
-        <w:t>Dunder traversal (CT101), dangerous system calls (CT102), sandbox escape globals (CT104), template inclusions (CT105), system prompt omission (CT110), backdoor phrases (CT111), and Jinja syntax errors (CT120).</w:t>
+        <w:t xml:space="preserve"/>
+      </w:r>
+    </w:p>
+    <w:p>
+      <w:r>
+        <w:t xml:space="preserve">Read current counts from pytest. Evaluation reports scoped fixture metrics, latency and available worker peak RSS; it does not establish real-world accuracy or prove exploits.</w:t>
+      </w:r>
+    </w:p>
+    <w:p>
+      <w:r>
+        <w:t xml:space="preserve"/>
       </w:r>
     </w:p>
     <w:p>
       <w:pPr>
-        <w:spacing w:before="280" w:after="80"/>
+        <w:pStyle w:val="Heading1"/>
       </w:pPr>
       <w:r>
-        <w:rPr>
-          <w:rFonts w:ascii="Calibri" w:hAnsi="Calibri"/>
-          <w:b/>
-          <w:color w:val="1B365D"/>
-          <w:sz w:val="28"/>
-        </w:rPr>
-        <w:t>2. Full Pipeline: Modules 1, 2, and 3 (All-in-One Scan)</w:t>
+        <w:t xml:space="preserve">Exit codes</w:t>
       </w:r>
     </w:p>
     <w:p>
-      <w:pPr>
-        <w:spacing w:after="120"/>
-      </w:pPr>
       <w:r>
-        <w:t xml:space="preserve">Use the standard ModelGuard CLI scanner when you want </w:t>
-      </w:r>
-      <w:r>
-        <w:rPr>
-          <w:b/>
-        </w:rPr>
-        <w:t>all checks performed together</w:t>
-      </w:r>
-      <w:r>
-        <w:t>: container parsing (Module 1), structural anomaly detection (Module 2), and chat template AST security analysis (Module 3).</w:t>
+        <w:t xml:space="preserve"/>
       </w:r>
     </w:p>
     <w:p>
-      <w:pPr>
-        <w:spacing w:after="40"/>
-      </w:pPr>
       <w:r>
-        <w:t>Standard terminal scan:</w:t>
-      </w:r>
-    </w:p>
-    <w:tbl>
-      <w:tblPr>
-        <w:tblW w:type="auto" w:w="0"/>
-        <w:jc w:val="center"/>
-        <w:tblLayout w:type="fixed"/>
-        <w:tblLook w:firstColumn="1" w:firstRow="1" w:lastColumn="0" w:lastRow="0" w:noHBand="0" w:noVBand="1" w:val="04A0"/>
-      </w:tblPr>
-      <w:tblGrid>
-        <w:gridCol w:w="9360"/>
-      </w:tblGrid>
-      <w:tr>
-        <w:tc>
-          <w:tcPr>
-            <w:tcW w:type="dxa" w:w="9360"/>
-            <w:shd w:fill="F0F4F8"/>
-            <w:tcBorders>
-              <w:top w:val="none"/>
-              <w:left w:val="single" w:sz="24" w:space="0" w:color="1B365D"/>
-              <w:bottom w:val="none"/>
-              <w:right w:val="none"/>
-            </w:tcBorders>
-          </w:tcPr>
-          <w:p>
-            <w:pPr>
-              <w:spacing w:before="120" w:after="120"/>
-              <w:ind w:left="216" w:right="216"/>
-            </w:pPr>
-            <w:r>
-              <w:rPr>
-                <w:rFonts w:ascii="Courier New" w:hAnsi="Courier New"/>
-                <w:b/>
-                <w:color w:val="141E2D"/>
-                <w:sz w:val="19"/>
-              </w:rPr>
-              <w:t>.venv/bin/python -m modelguard scan path/to/your_model.gguf</w:t>
-            </w:r>
-          </w:p>
-        </w:tc>
-      </w:tr>
-    </w:tbl>
-    <w:p>
-      <w:pPr>
-        <w:spacing w:after="80"/>
-      </w:pPr>
-    </w:p>
-    <w:p>
-      <w:pPr>
-        <w:spacing w:after="40"/>
-      </w:pPr>
-      <w:r>
-        <w:t>Scan with JSON and HTML report generation:</w:t>
-      </w:r>
-    </w:p>
-    <w:tbl>
-      <w:tblPr>
-        <w:tblW w:type="auto" w:w="0"/>
-        <w:jc w:val="center"/>
-        <w:tblLayout w:type="fixed"/>
-        <w:tblLook w:firstColumn="1" w:firstRow="1" w:lastColumn="0" w:lastRow="0" w:noHBand="0" w:noVBand="1" w:val="04A0"/>
-      </w:tblPr>
-      <w:tblGrid>
-        <w:gridCol w:w="9360"/>
-      </w:tblGrid>
-      <w:tr>
-        <w:tc>
-          <w:tcPr>
-            <w:tcW w:type="dxa" w:w="9360"/>
-            <w:shd w:fill="F0F4F8"/>
-            <w:tcBorders>
-              <w:top w:val="none"/>
-              <w:left w:val="single" w:sz="24" w:space="0" w:color="1B365D"/>
-              <w:bottom w:val="none"/>
-              <w:right w:val="none"/>
-            </w:tcBorders>
-          </w:tcPr>
-          <w:p>
-            <w:pPr>
-              <w:spacing w:before="120" w:after="120"/>
-              <w:ind w:left="216" w:right="216"/>
-            </w:pPr>
-            <w:r>
-              <w:rPr>
-                <w:rFonts w:ascii="Courier New" w:hAnsi="Courier New"/>
-                <w:b/>
-                <w:color w:val="141E2D"/>
-                <w:sz w:val="19"/>
-              </w:rPr>
-              <w:t>.venv/bin/python -m modelguard scan path/to/your_model.gguf \n  --json report.json \n  --html report.html</w:t>
-            </w:r>
-          </w:p>
-        </w:tc>
-      </w:tr>
-    </w:tbl>
-    <w:p>
-      <w:pPr>
-        <w:spacing w:after="80"/>
-      </w:pPr>
-    </w:p>
-    <w:p>
-      <w:pPr>
-        <w:pStyle w:val="ListBullet"/>
-        <w:spacing w:after="40"/>
-      </w:pPr>
-      <w:r>
-        <w:rPr>
-          <w:b/>
-        </w:rPr>
-        <w:t xml:space="preserve">Works identically for Safetensors: </w:t>
-      </w:r>
-      <w:r>
-        <w:t>Replace the path with your target .safetensors container.</w:t>
+        <w:t xml:space="preserve">0: no ERROR/CRITICAL findings and no incomplete requested analysis. 1: such findings or incomplete template coverage. 2: report-writing failure. Warnings require review; an absent template is not evidence of safety. Reports are still written when findings cause exit 1.</w:t>
       </w:r>
     </w:p>
     <w:p>
-      <w:pPr>
-        <w:spacing w:before="280" w:after="80"/>
-      </w:pPr>
       <w:r>
-        <w:rPr>
-          <w:rFonts w:ascii="Calibri" w:hAnsi="Calibri"/>
-          <w:b/>
-          <w:color w:val="1B365D"/>
-          <w:sz w:val="28"/>
-        </w:rPr>
-        <w:t>3. Automated Unit Testing (Pytest Suite)</w:t>
+        <w:t xml:space="preserve"/>
       </w:r>
     </w:p>
     <w:p>
-      <w:pPr>
-        <w:spacing w:after="120"/>
-      </w:pPr>
       <w:r>
-        <w:t>Use pytest to verify mathematical correctness and regression-test all extraction rules and AST inspection handlers without needing multi-gigabyte weight files.</w:t>
+        <w:t xml:space="preserve">Open report.html in a browser or file manager. macOS: open report.html. Linux: xdg-open report.html.</w:t>
       </w:r>
     </w:p>
-    <w:p>
-      <w:pPr>
-        <w:spacing w:after="40"/>
-      </w:pPr>
-      <w:r>
-        <w:t>Run Module 3 tests only (23 unit tests, verbose output):</w:t>
-      </w:r>
-    </w:p>
-    <w:tbl>
-      <w:tblPr>
-        <w:tblW w:type="auto" w:w="0"/>
-        <w:jc w:val="center"/>
-        <w:tblLayout w:type="fixed"/>
-        <w:tblLook w:firstColumn="1" w:firstRow="1" w:lastColumn="0" w:lastRow="0" w:noHBand="0" w:noVBand="1" w:val="04A0"/>
-      </w:tblPr>
-      <w:tblGrid>
-        <w:gridCol w:w="9360"/>
-      </w:tblGrid>
-      <w:tr>
-        <w:tc>
-          <w:tcPr>
-            <w:tcW w:type="dxa" w:w="9360"/>
-            <w:shd w:fill="F0F4F8"/>
-            <w:tcBorders>
-              <w:top w:val="none"/>
-              <w:left w:val="single" w:sz="24" w:space="0" w:color="1B365D"/>
-              <w:bottom w:val="none"/>
-              <w:right w:val="none"/>
-            </w:tcBorders>
-          </w:tcPr>
-          <w:p>
-            <w:pPr>
-              <w:spacing w:before="120" w:after="120"/>
-              <w:ind w:left="216" w:right="216"/>
-            </w:pPr>
-            <w:r>
-              <w:rPr>
-                <w:rFonts w:ascii="Courier New" w:hAnsi="Courier New"/>
-                <w:b/>
-                <w:color w:val="141E2D"/>
-                <w:sz w:val="19"/>
-              </w:rPr>
-              <w:t>.venv/bin/pytest tests/test_template_analyzer.py -v</w:t>
-            </w:r>
-          </w:p>
-        </w:tc>
-      </w:tr>
-    </w:tbl>
-    <w:p>
-      <w:pPr>
-        <w:spacing w:after="80"/>
-      </w:pPr>
-    </w:p>
-    <w:p>
-      <w:pPr>
-        <w:spacing w:after="40"/>
-      </w:pPr>
-      <w:r>
-        <w:t>Run entire project test suite (73 unit tests across Modules 1, 2, and 3):</w:t>
-      </w:r>
-    </w:p>
-    <w:tbl>
-      <w:tblPr>
-        <w:tblW w:type="auto" w:w="0"/>
-        <w:jc w:val="center"/>
-        <w:tblLayout w:type="fixed"/>
-        <w:tblLook w:firstColumn="1" w:firstRow="1" w:lastColumn="0" w:lastRow="0" w:noHBand="0" w:noVBand="1" w:val="04A0"/>
-      </w:tblPr>
-      <w:tblGrid>
-        <w:gridCol w:w="9360"/>
-      </w:tblGrid>
-      <w:tr>
-        <w:tc>
-          <w:tcPr>
-            <w:tcW w:type="dxa" w:w="9360"/>
-            <w:shd w:fill="F0F4F8"/>
-            <w:tcBorders>
-              <w:top w:val="none"/>
-              <w:left w:val="single" w:sz="24" w:space="0" w:color="1B365D"/>
-              <w:bottom w:val="none"/>
-              <w:right w:val="none"/>
-            </w:tcBorders>
-          </w:tcPr>
-          <w:p>
-            <w:pPr>
-              <w:spacing w:before="120" w:after="120"/>
-              <w:ind w:left="216" w:right="216"/>
-            </w:pPr>
-            <w:r>
-              <w:rPr>
-                <w:rFonts w:ascii="Courier New" w:hAnsi="Courier New"/>
-                <w:b/>
-                <w:color w:val="141E2D"/>
-                <w:sz w:val="19"/>
-              </w:rPr>
-              <w:t>.venv/bin/pytest -q</w:t>
-            </w:r>
-          </w:p>
-        </w:tc>
-      </w:tr>
-    </w:tbl>
-    <w:p>
-      <w:pPr>
-        <w:spacing w:after="80"/>
-      </w:pPr>
-    </w:p>
-    <w:p>
-      <w:pPr>
-        <w:spacing w:before="320" w:after="120"/>
-      </w:pPr>
-      <w:r>
-        <w:rPr>
-          <w:rFonts w:ascii="Calibri" w:hAnsi="Calibri"/>
-          <w:b/>
-          <w:color w:val="1B365D"/>
-          <w:sz w:val="28"/>
-        </w:rPr>
-        <w:t>4. Command Summary Cheat Sheet</w:t>
-      </w:r>
-    </w:p>
-    <w:tbl>
-      <w:tblPr>
-        <w:tblW w:type="auto" w:w="0"/>
-        <w:jc w:val="center"/>
-        <w:tblLayout w:type="fixed"/>
-        <w:tblLook w:firstColumn="1" w:firstRow="1" w:lastColumn="0" w:lastRow="0" w:noHBand="0" w:noVBand="1" w:val="04A0"/>
-      </w:tblPr>
-      <w:tblGrid>
-        <w:gridCol w:w="3120"/>
-        <w:gridCol w:w="3120"/>
-        <w:gridCol w:w="3120"/>
-      </w:tblGrid>
-      <w:tr>
-        <w:tc>
-          <w:tcPr>
-            <w:tcW w:type="dxa" w:w="2160"/>
-            <w:shd w:fill="1B365D"/>
-          </w:tcPr>
-          <w:p>
-            <w:r>
-              <w:rPr>
-                <w:b/>
-                <w:color w:val="FFFFFF"/>
-                <w:sz w:val="20"/>
-              </w:rPr>
-              <w:t>Target Scope</w:t>
-            </w:r>
-          </w:p>
-        </w:tc>
-        <w:tc>
-          <w:tcPr>
-            <w:tcW w:type="dxa" w:w="4608"/>
-            <w:shd w:fill="1B365D"/>
-          </w:tcPr>
-          <w:p>
-            <w:r>
-              <w:rPr>
-                <w:b/>
-                <w:color w:val="FFFFFF"/>
-                <w:sz w:val="20"/>
-              </w:rPr>
-              <w:t>Terminal Command</w:t>
-            </w:r>
-          </w:p>
-        </w:tc>
-        <w:tc>
-          <w:tcPr>
-            <w:tcW w:type="dxa" w:w="2592"/>
-            <w:shd w:fill="1B365D"/>
-          </w:tcPr>
-          <w:p>
-            <w:r>
-              <w:rPr>
-                <w:b/>
-                <w:color w:val="FFFFFF"/>
-                <w:sz w:val="20"/>
-              </w:rPr>
-              <w:t>Description</w:t>
-            </w:r>
-          </w:p>
-        </w:tc>
-      </w:tr>
-      <w:tr>
-        <w:tc>
-          <w:tcPr>
-            <w:tcW w:type="dxa" w:w="2160"/>
-            <w:shd w:fill="F9FAFC"/>
-          </w:tcPr>
-          <w:p>
-            <w:r>
-              <w:rPr>
-                <w:b/>
-                <w:sz w:val="18"/>
-              </w:rPr>
-              <w:t>Module 3 Only (Custom File)</w:t>
-            </w:r>
-          </w:p>
-        </w:tc>
-        <w:tc>
-          <w:tcPr>
-            <w:tcW w:type="dxa" w:w="4608"/>
-            <w:shd w:fill="FFFFFF"/>
-          </w:tcPr>
-          <w:p>
-            <w:r>
-              <w:rPr>
-                <w:rFonts w:ascii="Courier New" w:hAnsi="Courier New"/>
-                <w:sz w:val="17"/>
-              </w:rPr>
-              <w:t>.venv/bin/python demo_template.py &lt;path&gt;</w:t>
-            </w:r>
-          </w:p>
-        </w:tc>
-        <w:tc>
-          <w:tcPr>
-            <w:tcW w:type="dxa" w:w="2592"/>
-            <w:shd w:fill="F9FAFC"/>
-          </w:tcPr>
-          <w:p>
-            <w:r>
-              <w:rPr>
-                <w:sz w:val="18"/>
-              </w:rPr>
-              <w:t>Scans only the chat template of any GGUF/Safetensors model.</w:t>
-            </w:r>
-          </w:p>
-        </w:tc>
-      </w:tr>
-      <w:tr>
-        <w:tc>
-          <w:tcPr>
-            <w:tcW w:type="dxa" w:w="2160"/>
-            <w:shd w:fill="F9FAFC"/>
-          </w:tcPr>
-          <w:p>
-            <w:r>
-              <w:rPr>
-                <w:b/>
-                <w:sz w:val="18"/>
-              </w:rPr>
-              <w:t>Module 3 Demo (4 Scenarios)</w:t>
-            </w:r>
-          </w:p>
-        </w:tc>
-        <w:tc>
-          <w:tcPr>
-            <w:tcW w:type="dxa" w:w="4608"/>
-            <w:shd w:fill="FFFFFF"/>
-          </w:tcPr>
-          <w:p>
-            <w:r>
-              <w:rPr>
-                <w:rFonts w:ascii="Courier New" w:hAnsi="Courier New"/>
-                <w:sz w:val="17"/>
-              </w:rPr>
-              <w:t>.venv/bin/python demo_template.py</w:t>
-            </w:r>
-          </w:p>
-        </w:tc>
-        <w:tc>
-          <w:tcPr>
-            <w:tcW w:type="dxa" w:w="2592"/>
-            <w:shd w:fill="F9FAFC"/>
-          </w:tcPr>
-          <w:p>
-            <w:r>
-              <w:rPr>
-                <w:sz w:val="18"/>
-              </w:rPr>
-              <w:t>Demonstrates benign, exploit, backdoor, and syntax scenarios.</w:t>
-            </w:r>
-          </w:p>
-        </w:tc>
-      </w:tr>
-      <w:tr>
-        <w:tc>
-          <w:tcPr>
-            <w:tcW w:type="dxa" w:w="2160"/>
-            <w:shd w:fill="F9FAFC"/>
-          </w:tcPr>
-          <w:p>
-            <w:r>
-              <w:rPr>
-                <w:b/>
-                <w:sz w:val="18"/>
-              </w:rPr>
-              <w:t>Full Scan (All Modules)</w:t>
-            </w:r>
-          </w:p>
-        </w:tc>
-        <w:tc>
-          <w:tcPr>
-            <w:tcW w:type="dxa" w:w="4608"/>
-            <w:shd w:fill="FFFFFF"/>
-          </w:tcPr>
-          <w:p>
-            <w:r>
-              <w:rPr>
-                <w:rFonts w:ascii="Courier New" w:hAnsi="Courier New"/>
-                <w:sz w:val="17"/>
-              </w:rPr>
-              <w:t>.venv/bin/python -m modelguard scan &lt;path&gt;</w:t>
-            </w:r>
-          </w:p>
-        </w:tc>
-        <w:tc>
-          <w:tcPr>
-            <w:tcW w:type="dxa" w:w="2592"/>
-            <w:shd w:fill="F9FAFC"/>
-          </w:tcPr>
-          <w:p>
-            <w:r>
-              <w:rPr>
-                <w:sz w:val="18"/>
-              </w:rPr>
-              <w:t>Full pipeline: file parsing, structure analysis, and template checks.</w:t>
-            </w:r>
-          </w:p>
-        </w:tc>
-      </w:tr>
-      <w:tr>
-        <w:tc>
-          <w:tcPr>
-            <w:tcW w:type="dxa" w:w="2160"/>
-            <w:shd w:fill="F9FAFC"/>
-          </w:tcPr>
-          <w:p>
-            <w:r>
-              <w:rPr>
-                <w:b/>
-                <w:sz w:val="18"/>
-              </w:rPr>
-              <w:t>Full Scan + Reports</w:t>
-            </w:r>
-          </w:p>
-        </w:tc>
-        <w:tc>
-          <w:tcPr>
-            <w:tcW w:type="dxa" w:w="4608"/>
-            <w:shd w:fill="FFFFFF"/>
-          </w:tcPr>
-          <w:p>
-            <w:r>
-              <w:rPr>
-                <w:rFonts w:ascii="Courier New" w:hAnsi="Courier New"/>
-                <w:sz w:val="17"/>
-              </w:rPr>
-              <w:t>.venv/bin/python -m modelguard scan &lt;path&gt; --json out.json --html out.html</w:t>
-            </w:r>
-          </w:p>
-        </w:tc>
-        <w:tc>
-          <w:tcPr>
-            <w:tcW w:type="dxa" w:w="2592"/>
-            <w:shd w:fill="F9FAFC"/>
-          </w:tcPr>
-          <w:p>
-            <w:r>
-              <w:rPr>
-                <w:sz w:val="18"/>
-              </w:rPr>
-              <w:t>Executes full scan and writes JSON and HTML reports.</w:t>
-            </w:r>
-          </w:p>
-        </w:tc>
-      </w:tr>
-      <w:tr>
-        <w:tc>
-          <w:tcPr>
-            <w:tcW w:type="dxa" w:w="2160"/>
-            <w:shd w:fill="F9FAFC"/>
-          </w:tcPr>
-          <w:p>
-            <w:r>
-              <w:rPr>
-                <w:b/>
-                <w:sz w:val="18"/>
-              </w:rPr>
-              <w:t>Module 3 Tests</w:t>
-            </w:r>
-          </w:p>
-        </w:tc>
-        <w:tc>
-          <w:tcPr>
-            <w:tcW w:type="dxa" w:w="4608"/>
-            <w:shd w:fill="FFFFFF"/>
-          </w:tcPr>
-          <w:p>
-            <w:r>
-              <w:rPr>
-                <w:rFonts w:ascii="Courier New" w:hAnsi="Courier New"/>
-                <w:sz w:val="17"/>
-              </w:rPr>
-              <w:t>.venv/bin/pytest tests/test_template_analyzer.py -v</w:t>
-            </w:r>
-          </w:p>
-        </w:tc>
-        <w:tc>
-          <w:tcPr>
-            <w:tcW w:type="dxa" w:w="2592"/>
-            <w:shd w:fill="F9FAFC"/>
-          </w:tcPr>
-          <w:p>
-            <w:r>
-              <w:rPr>
-                <w:sz w:val="18"/>
-              </w:rPr>
-              <w:t>Runs 23 automated tests for chat template analyzer.</w:t>
-            </w:r>
-          </w:p>
-        </w:tc>
-      </w:tr>
-      <w:tr>
-        <w:tc>
-          <w:tcPr>
-            <w:tcW w:type="dxa" w:w="2160"/>
-            <w:shd w:fill="F9FAFC"/>
-          </w:tcPr>
-          <w:p>
-            <w:r>
-              <w:rPr>
-                <w:b/>
-                <w:sz w:val="18"/>
-              </w:rPr>
-              <w:t>Full Project Tests</w:t>
-            </w:r>
-          </w:p>
-        </w:tc>
-        <w:tc>
-          <w:tcPr>
-            <w:tcW w:type="dxa" w:w="4608"/>
-            <w:shd w:fill="FFFFFF"/>
-          </w:tcPr>
-          <w:p>
-            <w:r>
-              <w:rPr>
-                <w:rFonts w:ascii="Courier New" w:hAnsi="Courier New"/>
-                <w:sz w:val="17"/>
-              </w:rPr>
-              <w:t>.venv/bin/pytest -q</w:t>
-            </w:r>
-          </w:p>
-        </w:tc>
-        <w:tc>
-          <w:tcPr>
-            <w:tcW w:type="dxa" w:w="2592"/>
-            <w:shd w:fill="F9FAFC"/>
-          </w:tcPr>
-          <w:p>
-            <w:r>
-              <w:rPr>
-                <w:sz w:val="18"/>
-              </w:rPr>
-              <w:t>Runs all 73 tests across the entire ModelGuard project.</w:t>
-            </w:r>
-          </w:p>
-        </w:tc>
-      </w:tr>
-    </w:tbl>
     <w:sectPr>
       <w:pgSz w:w="12240" w:h="15840"/>
       <w:pgMar w:top="1440" w:right="1440" w:bottom="1440" w:left="1440" w:header="720" w:footer="720" w:gutter="0"/>

</xml_diff>